<commit_message>
procedural generation updates and partual multiplayer
added:
double paths
city names
min and max route segments
destination card generation
route highlighting
route selectable
beginings of a multiplayer
start screen
some other stuff i probablr forgot i added
</commit_message>
<xml_diff>
--- a/Documents/Procedural Ticket to Ride.docx
+++ b/Documents/Procedural Ticket to Ride.docx
@@ -34,15 +34,13 @@
         <w:t xml:space="preserve">” </w:t>
       </w:r>
       <w:r>
-        <w:t xml:space="preserve">mechanics, featuring a robust procedural map generation system. The goal is to create </w:t>
-      </w:r>
-      <w:proofErr w:type="gramStart"/>
-      <w:r>
-        <w:t>" balanced</w:t>
-      </w:r>
-      <w:proofErr w:type="gramEnd"/>
-      <w:r>
-        <w:t>, playable, and aesthetically pleasing rail networks dynamically.</w:t>
+        <w:t>mechanics, featuring a robust procedural map generation system. The goal is to create</w:t>
+      </w:r>
+      <w:r>
+        <w:t xml:space="preserve"> </w:t>
+      </w:r>
+      <w:r>
+        <w:t>balanced, playable, and aesthetically pleasing rail networks dynamically.</w:t>
       </w:r>
     </w:p>
     <w:p/>
@@ -76,15 +74,18 @@
         <w:ind w:left="360"/>
       </w:pPr>
       <w:r>
-        <w:t xml:space="preserve">Stores city IDs as keys and Vector2 coordinates as values. This allows for </w:t>
+        <w:t>Stores city IDs as keys and Vector2 coordinates as values. This allows for</w:t>
+      </w:r>
+      <w:r>
+        <w:t xml:space="preserve"> </w:t>
       </w:r>
       <w:proofErr w:type="gramStart"/>
       <w:r>
-        <w:t>O(</w:t>
+        <w:t>coordinate</w:t>
       </w:r>
       <w:proofErr w:type="gramEnd"/>
       <w:r>
-        <w:t>1) coordinate lookup during pathfinding and rendering.</w:t>
+        <w:t xml:space="preserve"> lookup during pathfinding and rendering.</w:t>
       </w:r>
     </w:p>
     <w:p>
@@ -467,8 +468,6 @@
         <w:t>Visual Elements: visual elements are drawn or placed in empty space on the map dependent on the size of empty space. (large empty space = mountain image, small empty space = tress, lakes, animals</w:t>
       </w:r>
     </w:p>
-    <w:p/>
-    <w:p/>
     <w:sectPr>
       <w:pgSz w:w="12240" w:h="15840"/>
       <w:pgMar w:top="1440" w:right="1440" w:bottom="1440" w:left="1440" w:header="720" w:footer="720" w:gutter="0"/>
@@ -1319,6 +1318,7 @@
   <w:style w:type="character" w:default="1" w:styleId="DefaultParagraphFont">
     <w:name w:val="Default Paragraph Font"/>
     <w:uiPriority w:val="1"/>
+    <w:semiHidden/>
     <w:unhideWhenUsed/>
   </w:style>
   <w:style w:type="table" w:default="1" w:styleId="TableNormal">

</xml_diff>